<commit_message>
feat: accept uploads with external source project IDs
</commit_message>
<xml_diff>
--- a/docs/ControlCheck_AI_PRD_v1.2.docx
+++ b/docs/ControlCheck_AI_PRD_v1.2.docx
@@ -18487,6 +18487,19 @@
       </w:tr>
     </w:tbl>
     <w:p/>
+    <w:p>
+      <w:pPr>
+        <w:pStyle w:val="Heading2"/>
+      </w:pPr>
+      <w:r>
+        <w:t>10.4 Project Identity During Ingestion</w:t>
+      </w:r>
+    </w:p>
+    <w:p>
+      <w:r>
+        <w:t>The selected ControlCheck project is the authoritative destination for an upload. The workbook Project_Info.project_id is retained as source_project_id for traceability; a differing source identifier produces a warning and does not block ingestion. Missing project identity, invalid workbook structure, tenant mismatch, and storage failures remain blocking validation errors.</w:t>
+      </w:r>
+    </w:p>
     <w:sectPr>
       <w:footerReference w:type="default" r:id="rId9"/>
       <w:pgSz w:w="12240" w:h="15840"/>

</xml_diff>